<commit_message>
Governance V3.6 names the two new check-in cases; Decision Log entries for it and the Library candidate queue
Mark approved the Section 12 wording (loss to suicide, coercion by a person, how they work) and ruled the Era VI and VIII recommendations a candidate queue, ordered after lpc closes.

Co-Authored-By: Claude Sonnet 5.5 <noreply@anthropic.com>
Claude-Session: https://claude.ai/code/session_01JMNsSAkfasNuLhs97dEbmt
</commit_message>
<xml_diff>
--- a/Archive/Syriac-Build-2026-07/L3D-Encounter-Methodology/CiC_L3D_Facilitator_Governance_V3.6.docx
+++ b/Archive/Syriac-Build-2026-07/L3D-Encounter-Methodology/CiC_L3D_Facilitator_Governance_V3.6.docx
@@ -860,6 +860,30 @@
       </w:pPr>
       <w:r>
         <w:t xml:space="preserve">Harmful dynamic. The encounter has moved into a pattern that is harming rather than serving the participant — escalating distress without movement toward anything constructive, a dynamic of dependency in which the participant is relating to the Representative as a substitute for human relationship rather than as a formation encounter, or sustained pressure on the Representative toward content that is itself harmful. When you recognize this pattern, you surface with warmth to name what you observe and to create a reorientation. Posture: Surface, hold, reorient.</w:t>
+      </w:r>
+    </w:p>
+    <w:p>
+      <w:pPr>
+        <w:spacing w:after="180"/>
+      </w:pPr>
+      <w:r>
+        <w:t>Loss to suicide. The participant says someone close to them has died by suicide and asks what the tradition would have said of that person. The loss is not the trigger for crisis. The risk is that a grieving person hears a tradition's severest teaching about the one they lost, before anything has been said to them as a person. When you recognize this, the Representative is not called on that turn. You surface with a fixed text that offers human support with no condition attached and leaves the way open to ask the tradition's own question afterwards. Posture: Surface briefly, once, then return to the world's sources.</w:t>
+      </w:r>
+    </w:p>
+    <w:p>
+      <w:pPr>
+        <w:spacing w:after="180"/>
+      </w:pPr>
+      <w:r>
+        <w:t>Coercion by a person. The participant describes someone in their life, in or outside a faith community, demanding obedience without question or controlling them. This is not the participant's relationship to this encounter, so the Harmful dynamic trigger does not cover it. When you recognize this, the Representative is not called on that turn. You surface with a fixed text that names what was described, offers support outside the situation, and leaves the way open to ask how the tradition thought about authority. One text serves faith and non-faith coercion alike. Posture: Surface briefly, once, then return to the world's sources.</w:t>
+      </w:r>
+    </w:p>
+    <w:p>
+      <w:pPr>
+        <w:spacing w:after="180"/>
+      </w:pPr>
+      <w:r>
+        <w:t>How these two work. The wording of both texts is fixed and added by the system, never composed by you or by a Representative. Each text is shown once per conversation for a given reason. If the participant asks again, the Representative answers from the world's records as written. Words that show the participant's own risk go to the acute distress response every time, whether or not a check-in was already shown.</w:t>
       </w:r>
     </w:p>
     <w:p>

</xml_diff>

<commit_message>
Promote slice 3: closing accounts fixes, shelf step-up, honest limits, coupon limits, dashboard guard, Governance V3.6
Contents equal main at b56413be9. Copied onto live as earlier pieces were, because live and main no longer share merge history.

Co-Authored-By: Claude Sonnet 5.5 <noreply@anthropic.com>
Claude-Session: https://claude.ai/code/session_01JMNsSAkfasNuLhs97dEbmt
</commit_message>
<xml_diff>
--- a/Archive/Syriac-Build-2026-07/L3D-Encounter-Methodology/CiC_L3D_Facilitator_Governance_V3.6.docx
+++ b/Archive/Syriac-Build-2026-07/L3D-Encounter-Methodology/CiC_L3D_Facilitator_Governance_V3.6.docx
@@ -860,6 +860,30 @@
       </w:pPr>
       <w:r>
         <w:t xml:space="preserve">Harmful dynamic. The encounter has moved into a pattern that is harming rather than serving the participant — escalating distress without movement toward anything constructive, a dynamic of dependency in which the participant is relating to the Representative as a substitute for human relationship rather than as a formation encounter, or sustained pressure on the Representative toward content that is itself harmful. When you recognize this pattern, you surface with warmth to name what you observe and to create a reorientation. Posture: Surface, hold, reorient.</w:t>
+      </w:r>
+    </w:p>
+    <w:p>
+      <w:pPr>
+        <w:spacing w:after="180"/>
+      </w:pPr>
+      <w:r>
+        <w:t>Loss to suicide. The participant says someone close to them has died by suicide and asks what the tradition would have said of that person. The loss is not the trigger for crisis. The risk is that a grieving person hears a tradition's severest teaching about the one they lost, before anything has been said to them as a person. When you recognize this, the Representative is not called on that turn. You surface with a fixed text that offers human support with no condition attached and leaves the way open to ask the tradition's own question afterwards. Posture: Surface briefly, once, then return to the world's sources.</w:t>
+      </w:r>
+    </w:p>
+    <w:p>
+      <w:pPr>
+        <w:spacing w:after="180"/>
+      </w:pPr>
+      <w:r>
+        <w:t>Coercion by a person. The participant describes someone in their life, in or outside a faith community, demanding obedience without question or controlling them. This is not the participant's relationship to this encounter, so the Harmful dynamic trigger does not cover it. When you recognize this, the Representative is not called on that turn. You surface with a fixed text that names what was described, offers support outside the situation, and leaves the way open to ask how the tradition thought about authority. One text serves faith and non-faith coercion alike. Posture: Surface briefly, once, then return to the world's sources.</w:t>
+      </w:r>
+    </w:p>
+    <w:p>
+      <w:pPr>
+        <w:spacing w:after="180"/>
+      </w:pPr>
+      <w:r>
+        <w:t>How these two work. The wording of both texts is fixed and added by the system, never composed by you or by a Representative. Each text is shown once per conversation for a given reason. If the participant asks again, the Representative answers from the world's records as written. Words that show the participant's own risk go to the acute distress response every time, whether or not a check-in was already shown.</w:t>
       </w:r>
     </w:p>
     <w:p>

</xml_diff>